<commit_message>
Dokumentation angepasst - Flussdiagramm eingefügt
</commit_message>
<xml_diff>
--- a/Dokumentation.docx
+++ b/Dokumentation.docx
@@ -141,7 +141,7 @@
             </w:rPr>
             <w:fldChar w:fldCharType="separate"/>
           </w:r>
-          <w:hyperlink w:anchor="_Toc230438695" w:history="1">
+          <w:hyperlink w:anchor="_Toc230519085" w:history="1">
             <w:r>
               <w:rPr>
                 <w:rStyle w:val="Hyperlink"/>
@@ -169,7 +169,7 @@
                 <w:noProof/>
                 <w:webHidden/>
               </w:rPr>
-              <w:instrText xml:space="preserve"> PAGEREF _Toc230438695 \h </w:instrText>
+              <w:instrText xml:space="preserve"> PAGEREF _Toc230519085 \h </w:instrText>
             </w:r>
             <w:r>
               <w:rPr>
@@ -212,7 +212,7 @@
               <w:lang w:eastAsia="de-AT"/>
             </w:rPr>
           </w:pPr>
-          <w:hyperlink w:anchor="_Toc230438696" w:history="1">
+          <w:hyperlink w:anchor="_Toc230519086" w:history="1">
             <w:r>
               <w:rPr>
                 <w:rStyle w:val="Hyperlink"/>
@@ -240,7 +240,7 @@
                 <w:noProof/>
                 <w:webHidden/>
               </w:rPr>
-              <w:instrText xml:space="preserve"> PAGEREF _Toc230438696 \h </w:instrText>
+              <w:instrText xml:space="preserve"> PAGEREF _Toc230519086 \h </w:instrText>
             </w:r>
             <w:r>
               <w:rPr>
@@ -283,7 +283,7 @@
               <w:lang w:eastAsia="de-AT"/>
             </w:rPr>
           </w:pPr>
-          <w:hyperlink w:anchor="_Toc230438697" w:history="1">
+          <w:hyperlink w:anchor="_Toc230519087" w:history="1">
             <w:r>
               <w:rPr>
                 <w:rStyle w:val="Hyperlink"/>
@@ -311,7 +311,7 @@
                 <w:noProof/>
                 <w:webHidden/>
               </w:rPr>
-              <w:instrText xml:space="preserve"> PAGEREF _Toc230438697 \h </w:instrText>
+              <w:instrText xml:space="preserve"> PAGEREF _Toc230519087 \h </w:instrText>
             </w:r>
             <w:r>
               <w:rPr>
@@ -354,7 +354,7 @@
               <w:lang w:eastAsia="de-AT"/>
             </w:rPr>
           </w:pPr>
-          <w:hyperlink w:anchor="_Toc230438698" w:history="1">
+          <w:hyperlink w:anchor="_Toc230519088" w:history="1">
             <w:r>
               <w:rPr>
                 <w:rStyle w:val="Hyperlink"/>
@@ -382,7 +382,7 @@
                 <w:noProof/>
                 <w:webHidden/>
               </w:rPr>
-              <w:instrText xml:space="preserve"> PAGEREF _Toc230438698 \h </w:instrText>
+              <w:instrText xml:space="preserve"> PAGEREF _Toc230519088 \h </w:instrText>
             </w:r>
             <w:r>
               <w:rPr>
@@ -425,7 +425,7 @@
               <w:lang w:eastAsia="de-AT"/>
             </w:rPr>
           </w:pPr>
-          <w:hyperlink w:anchor="_Toc230438699" w:history="1">
+          <w:hyperlink w:anchor="_Toc230519089" w:history="1">
             <w:r>
               <w:rPr>
                 <w:rStyle w:val="Hyperlink"/>
@@ -453,7 +453,7 @@
                 <w:noProof/>
                 <w:webHidden/>
               </w:rPr>
-              <w:instrText xml:space="preserve"> PAGEREF _Toc230438699 \h </w:instrText>
+              <w:instrText xml:space="preserve"> PAGEREF _Toc230519089 \h </w:instrText>
             </w:r>
             <w:r>
               <w:rPr>
@@ -496,7 +496,7 @@
               <w:lang w:eastAsia="de-AT"/>
             </w:rPr>
           </w:pPr>
-          <w:hyperlink w:anchor="_Toc230438700" w:history="1">
+          <w:hyperlink w:anchor="_Toc230519090" w:history="1">
             <w:r>
               <w:rPr>
                 <w:rStyle w:val="Hyperlink"/>
@@ -524,7 +524,7 @@
                 <w:noProof/>
                 <w:webHidden/>
               </w:rPr>
-              <w:instrText xml:space="preserve"> PAGEREF _Toc230438700 \h </w:instrText>
+              <w:instrText xml:space="preserve"> PAGEREF _Toc230519090 \h </w:instrText>
             </w:r>
             <w:r>
               <w:rPr>
@@ -567,7 +567,7 @@
               <w:lang w:eastAsia="de-AT"/>
             </w:rPr>
           </w:pPr>
-          <w:hyperlink w:anchor="_Toc230438701" w:history="1">
+          <w:hyperlink w:anchor="_Toc230519091" w:history="1">
             <w:r>
               <w:rPr>
                 <w:rStyle w:val="Hyperlink"/>
@@ -595,7 +595,7 @@
                 <w:noProof/>
                 <w:webHidden/>
               </w:rPr>
-              <w:instrText xml:space="preserve"> PAGEREF _Toc230438701 \h </w:instrText>
+              <w:instrText xml:space="preserve"> PAGEREF _Toc230519091 \h </w:instrText>
             </w:r>
             <w:r>
               <w:rPr>
@@ -638,7 +638,7 @@
               <w:lang w:eastAsia="de-AT"/>
             </w:rPr>
           </w:pPr>
-          <w:hyperlink w:anchor="_Toc230438702" w:history="1">
+          <w:hyperlink w:anchor="_Toc230519092" w:history="1">
             <w:r>
               <w:rPr>
                 <w:rStyle w:val="Hyperlink"/>
@@ -666,7 +666,7 @@
                 <w:noProof/>
                 <w:webHidden/>
               </w:rPr>
-              <w:instrText xml:space="preserve"> PAGEREF _Toc230438702 \h </w:instrText>
+              <w:instrText xml:space="preserve"> PAGEREF _Toc230519092 \h </w:instrText>
             </w:r>
             <w:r>
               <w:rPr>
@@ -709,7 +709,7 @@
               <w:lang w:eastAsia="de-AT"/>
             </w:rPr>
           </w:pPr>
-          <w:hyperlink w:anchor="_Toc230438703" w:history="1">
+          <w:hyperlink w:anchor="_Toc230519093" w:history="1">
             <w:r>
               <w:rPr>
                 <w:rStyle w:val="Hyperlink"/>
@@ -737,7 +737,7 @@
                 <w:noProof/>
                 <w:webHidden/>
               </w:rPr>
-              <w:instrText xml:space="preserve"> PAGEREF _Toc230438703 \h </w:instrText>
+              <w:instrText xml:space="preserve"> PAGEREF _Toc230519093 \h </w:instrText>
             </w:r>
             <w:r>
               <w:rPr>
@@ -780,7 +780,7 @@
               <w:lang w:eastAsia="de-AT"/>
             </w:rPr>
           </w:pPr>
-          <w:hyperlink w:anchor="_Toc230438704" w:history="1">
+          <w:hyperlink w:anchor="_Toc230519094" w:history="1">
             <w:r>
               <w:rPr>
                 <w:rStyle w:val="Hyperlink"/>
@@ -808,7 +808,7 @@
                 <w:noProof/>
                 <w:webHidden/>
               </w:rPr>
-              <w:instrText xml:space="preserve"> PAGEREF _Toc230438704 \h </w:instrText>
+              <w:instrText xml:space="preserve"> PAGEREF _Toc230519094 \h </w:instrText>
             </w:r>
             <w:r>
               <w:rPr>
@@ -851,14 +851,14 @@
               <w:lang w:eastAsia="de-AT"/>
             </w:rPr>
           </w:pPr>
-          <w:hyperlink w:anchor="_Toc230438705" w:history="1">
+          <w:hyperlink w:anchor="_Toc230519095" w:history="1">
             <w:r>
               <w:rPr>
                 <w:rStyle w:val="Hyperlink"/>
-                <w:rFonts w:ascii="Arial Nova" w:hAnsi="Arial Nova" w:cs="Calibri"/>
-                <w:noProof/>
-              </w:rPr>
-              <w:t>7.1 Hauptschleife (Main Loop)</w:t>
+                <w:rFonts w:ascii="Arial Nova" w:hAnsi="Arial Nova"/>
+                <w:noProof/>
+              </w:rPr>
+              <w:t>7.1 Flussdiagramm</w:t>
             </w:r>
             <w:r>
               <w:rPr>
@@ -879,7 +879,7 @@
                 <w:noProof/>
                 <w:webHidden/>
               </w:rPr>
-              <w:instrText xml:space="preserve"> PAGEREF _Toc230438705 \h </w:instrText>
+              <w:instrText xml:space="preserve"> PAGEREF _Toc230519095 \h </w:instrText>
             </w:r>
             <w:r>
               <w:rPr>
@@ -922,14 +922,14 @@
               <w:lang w:eastAsia="de-AT"/>
             </w:rPr>
           </w:pPr>
-          <w:hyperlink w:anchor="_Toc230438706" w:history="1">
+          <w:hyperlink w:anchor="_Toc230519096" w:history="1">
             <w:r>
               <w:rPr>
                 <w:rStyle w:val="Hyperlink"/>
                 <w:rFonts w:ascii="Arial Nova" w:hAnsi="Arial Nova" w:cs="Calibri"/>
                 <w:noProof/>
               </w:rPr>
-              <w:t>7.2 Fehlerbehandlung</w:t>
+              <w:t>7.2 Hauptschleife (Main Loop)</w:t>
             </w:r>
             <w:r>
               <w:rPr>
@@ -950,7 +950,7 @@
                 <w:noProof/>
                 <w:webHidden/>
               </w:rPr>
-              <w:instrText xml:space="preserve"> PAGEREF _Toc230438706 \h </w:instrText>
+              <w:instrText xml:space="preserve"> PAGEREF _Toc230519096 \h </w:instrText>
             </w:r>
             <w:r>
               <w:rPr>
@@ -971,6 +971,77 @@
                 <w:webHidden/>
               </w:rPr>
               <w:t>6</w:t>
+            </w:r>
+            <w:r>
+              <w:rPr>
+                <w:noProof/>
+                <w:webHidden/>
+              </w:rPr>
+              <w:fldChar w:fldCharType="end"/>
+            </w:r>
+          </w:hyperlink>
+        </w:p>
+        <w:p>
+          <w:pPr>
+            <w:pStyle w:val="Verzeichnis2"/>
+            <w:tabs>
+              <w:tab w:val="right" w:leader="dot" w:pos="9062"/>
+            </w:tabs>
+            <w:rPr>
+              <w:rFonts w:eastAsiaTheme="minorEastAsia"/>
+              <w:noProof/>
+              <w:lang w:eastAsia="de-AT"/>
+            </w:rPr>
+          </w:pPr>
+          <w:hyperlink w:anchor="_Toc230519097" w:history="1">
+            <w:r>
+              <w:rPr>
+                <w:rStyle w:val="Hyperlink"/>
+                <w:rFonts w:ascii="Arial Nova" w:hAnsi="Arial Nova" w:cs="Calibri"/>
+                <w:noProof/>
+              </w:rPr>
+              <w:t>7.3 Fehlerbehandlung</w:t>
+            </w:r>
+            <w:r>
+              <w:rPr>
+                <w:noProof/>
+                <w:webHidden/>
+              </w:rPr>
+              <w:tab/>
+            </w:r>
+            <w:r>
+              <w:rPr>
+                <w:noProof/>
+                <w:webHidden/>
+              </w:rPr>
+              <w:fldChar w:fldCharType="begin"/>
+            </w:r>
+            <w:r>
+              <w:rPr>
+                <w:noProof/>
+                <w:webHidden/>
+              </w:rPr>
+              <w:instrText xml:space="preserve"> PAGEREF _Toc230519097 \h </w:instrText>
+            </w:r>
+            <w:r>
+              <w:rPr>
+                <w:noProof/>
+                <w:webHidden/>
+              </w:rPr>
+            </w:r>
+            <w:r>
+              <w:rPr>
+                <w:noProof/>
+                <w:webHidden/>
+              </w:rPr>
+              <w:fldChar w:fldCharType="separate"/>
+            </w:r>
+            <w:r>
+              <w:rPr>
+                <w:noProof/>
+                <w:webHidden/>
+              </w:rPr>
+              <w:t>7</w:t>
             </w:r>
             <w:r>
               <w:rPr>
@@ -993,7 +1064,7 @@
               <w:lang w:eastAsia="de-AT"/>
             </w:rPr>
           </w:pPr>
-          <w:hyperlink w:anchor="_Toc230438707" w:history="1">
+          <w:hyperlink w:anchor="_Toc230519098" w:history="1">
             <w:r>
               <w:rPr>
                 <w:rStyle w:val="Hyperlink"/>
@@ -1021,7 +1092,7 @@
                 <w:noProof/>
                 <w:webHidden/>
               </w:rPr>
-              <w:instrText xml:space="preserve"> PAGEREF _Toc230438707 \h </w:instrText>
+              <w:instrText xml:space="preserve"> PAGEREF _Toc230519098 \h </w:instrText>
             </w:r>
             <w:r>
               <w:rPr>
@@ -1041,7 +1112,7 @@
                 <w:noProof/>
                 <w:webHidden/>
               </w:rPr>
-              <w:t>7</w:t>
+              <w:t>8</w:t>
             </w:r>
             <w:r>
               <w:rPr>
@@ -1064,7 +1135,7 @@
               <w:lang w:eastAsia="de-AT"/>
             </w:rPr>
           </w:pPr>
-          <w:hyperlink w:anchor="_Toc230438708" w:history="1">
+          <w:hyperlink w:anchor="_Toc230519099" w:history="1">
             <w:r>
               <w:rPr>
                 <w:rStyle w:val="Hyperlink"/>
@@ -1092,7 +1163,7 @@
                 <w:noProof/>
                 <w:webHidden/>
               </w:rPr>
-              <w:instrText xml:space="preserve"> PAGEREF _Toc230438708 \h </w:instrText>
+              <w:instrText xml:space="preserve"> PAGEREF _Toc230519099 \h </w:instrText>
             </w:r>
             <w:r>
               <w:rPr>
@@ -1112,7 +1183,7 @@
                 <w:noProof/>
                 <w:webHidden/>
               </w:rPr>
-              <w:t>7</w:t>
+              <w:t>8</w:t>
             </w:r>
             <w:r>
               <w:rPr>
@@ -1135,7 +1206,7 @@
               <w:lang w:eastAsia="de-AT"/>
             </w:rPr>
           </w:pPr>
-          <w:hyperlink w:anchor="_Toc230438709" w:history="1">
+          <w:hyperlink w:anchor="_Toc230519100" w:history="1">
             <w:r>
               <w:rPr>
                 <w:rStyle w:val="Hyperlink"/>
@@ -1163,7 +1234,7 @@
                 <w:noProof/>
                 <w:webHidden/>
               </w:rPr>
-              <w:instrText xml:space="preserve"> PAGEREF _Toc230438709 \h </w:instrText>
+              <w:instrText xml:space="preserve"> PAGEREF _Toc230519100 \h </w:instrText>
             </w:r>
             <w:r>
               <w:rPr>
@@ -1183,7 +1254,7 @@
                 <w:noProof/>
                 <w:webHidden/>
               </w:rPr>
-              <w:t>7</w:t>
+              <w:t>8</w:t>
             </w:r>
             <w:r>
               <w:rPr>
@@ -1206,7 +1277,7 @@
               <w:lang w:eastAsia="de-AT"/>
             </w:rPr>
           </w:pPr>
-          <w:hyperlink w:anchor="_Toc230438710" w:history="1">
+          <w:hyperlink w:anchor="_Toc230519101" w:history="1">
             <w:r>
               <w:rPr>
                 <w:rStyle w:val="Hyperlink"/>
@@ -1234,7 +1305,7 @@
                 <w:noProof/>
                 <w:webHidden/>
               </w:rPr>
-              <w:instrText xml:space="preserve"> PAGEREF _Toc230438710 \h </w:instrText>
+              <w:instrText xml:space="preserve"> PAGEREF _Toc230519101 \h </w:instrText>
             </w:r>
             <w:r>
               <w:rPr>
@@ -1254,7 +1325,7 @@
                 <w:noProof/>
                 <w:webHidden/>
               </w:rPr>
-              <w:t>7</w:t>
+              <w:t>8</w:t>
             </w:r>
             <w:r>
               <w:rPr>
@@ -1277,7 +1348,7 @@
               <w:lang w:eastAsia="de-AT"/>
             </w:rPr>
           </w:pPr>
-          <w:hyperlink w:anchor="_Toc230438711" w:history="1">
+          <w:hyperlink w:anchor="_Toc230519102" w:history="1">
             <w:r>
               <w:rPr>
                 <w:rStyle w:val="Hyperlink"/>
@@ -1305,7 +1376,7 @@
                 <w:noProof/>
                 <w:webHidden/>
               </w:rPr>
-              <w:instrText xml:space="preserve"> PAGEREF _Toc230438711 \h </w:instrText>
+              <w:instrText xml:space="preserve"> PAGEREF _Toc230519102 \h </w:instrText>
             </w:r>
             <w:r>
               <w:rPr>
@@ -1325,7 +1396,7 @@
                 <w:noProof/>
                 <w:webHidden/>
               </w:rPr>
-              <w:t>8</w:t>
+              <w:t>9</w:t>
             </w:r>
             <w:r>
               <w:rPr>
@@ -1348,7 +1419,7 @@
               <w:lang w:eastAsia="de-AT"/>
             </w:rPr>
           </w:pPr>
-          <w:hyperlink w:anchor="_Toc230438712" w:history="1">
+          <w:hyperlink w:anchor="_Toc230519103" w:history="1">
             <w:r>
               <w:rPr>
                 <w:rStyle w:val="Hyperlink"/>
@@ -1376,7 +1447,7 @@
                 <w:noProof/>
                 <w:webHidden/>
               </w:rPr>
-              <w:instrText xml:space="preserve"> PAGEREF _Toc230438712 \h </w:instrText>
+              <w:instrText xml:space="preserve"> PAGEREF _Toc230519103 \h </w:instrText>
             </w:r>
             <w:r>
               <w:rPr>
@@ -1396,7 +1467,7 @@
                 <w:noProof/>
                 <w:webHidden/>
               </w:rPr>
-              <w:t>8</w:t>
+              <w:t>9</w:t>
             </w:r>
             <w:r>
               <w:rPr>
@@ -1419,7 +1490,7 @@
               <w:lang w:eastAsia="de-AT"/>
             </w:rPr>
           </w:pPr>
-          <w:hyperlink w:anchor="_Toc230438713" w:history="1">
+          <w:hyperlink w:anchor="_Toc230519104" w:history="1">
             <w:r>
               <w:rPr>
                 <w:rStyle w:val="Hyperlink"/>
@@ -1447,7 +1518,7 @@
                 <w:noProof/>
                 <w:webHidden/>
               </w:rPr>
-              <w:instrText xml:space="preserve"> PAGEREF _Toc230438713 \h </w:instrText>
+              <w:instrText xml:space="preserve"> PAGEREF _Toc230519104 \h </w:instrText>
             </w:r>
             <w:r>
               <w:rPr>
@@ -1467,7 +1538,7 @@
                 <w:noProof/>
                 <w:webHidden/>
               </w:rPr>
-              <w:t>9</w:t>
+              <w:t>10</w:t>
             </w:r>
             <w:r>
               <w:rPr>
@@ -1490,7 +1561,7 @@
               <w:lang w:eastAsia="de-AT"/>
             </w:rPr>
           </w:pPr>
-          <w:hyperlink w:anchor="_Toc230438714" w:history="1">
+          <w:hyperlink w:anchor="_Toc230519105" w:history="1">
             <w:r>
               <w:rPr>
                 <w:rStyle w:val="Hyperlink"/>
@@ -1518,7 +1589,7 @@
                 <w:noProof/>
                 <w:webHidden/>
               </w:rPr>
-              <w:instrText xml:space="preserve"> PAGEREF _Toc230438714 \h </w:instrText>
+              <w:instrText xml:space="preserve"> PAGEREF _Toc230519105 \h </w:instrText>
             </w:r>
             <w:r>
               <w:rPr>
@@ -1538,7 +1609,7 @@
                 <w:noProof/>
                 <w:webHidden/>
               </w:rPr>
-              <w:t>10</w:t>
+              <w:t>11</w:t>
             </w:r>
             <w:r>
               <w:rPr>
@@ -1596,7 +1667,7 @@
           <w:rFonts w:ascii="Arial Nova" w:hAnsi="Arial Nova" w:cs="Calibri"/>
         </w:rPr>
       </w:pPr>
-      <w:bookmarkStart w:id="0" w:name="_Toc230438695"/>
+      <w:bookmarkStart w:id="0" w:name="_Toc230519085"/>
       <w:r>
         <w:rPr>
           <w:rFonts w:ascii="Arial Nova" w:hAnsi="Arial Nova" w:cs="Calibri"/>
@@ -1628,7 +1699,7 @@
           <w:rFonts w:ascii="Arial Nova" w:hAnsi="Arial Nova" w:cs="Calibri"/>
         </w:rPr>
       </w:pPr>
-      <w:bookmarkStart w:id="1" w:name="_Toc230438696"/>
+      <w:bookmarkStart w:id="1" w:name="_Toc230519086"/>
       <w:r>
         <w:rPr>
           <w:rFonts w:ascii="Arial Nova" w:hAnsi="Arial Nova" w:cs="Calibri"/>
@@ -1644,7 +1715,7 @@
           <w:rFonts w:ascii="Arial Nova" w:hAnsi="Arial Nova" w:cs="Calibri"/>
         </w:rPr>
       </w:pPr>
-      <w:bookmarkStart w:id="2" w:name="_Toc230438697"/>
+      <w:bookmarkStart w:id="2" w:name="_Toc230519087"/>
       <w:r>
         <w:rPr>
           <w:rFonts w:ascii="Arial Nova" w:hAnsi="Arial Nova" w:cs="Calibri"/>
@@ -1752,7 +1823,7 @@
           <w:rFonts w:ascii="Arial Nova" w:hAnsi="Arial Nova" w:cs="Calibri"/>
         </w:rPr>
       </w:pPr>
-      <w:bookmarkStart w:id="3" w:name="_Toc230438698"/>
+      <w:bookmarkStart w:id="3" w:name="_Toc230519088"/>
       <w:r>
         <w:rPr>
           <w:rFonts w:ascii="Arial Nova" w:hAnsi="Arial Nova" w:cs="Calibri"/>
@@ -1809,7 +1880,7 @@
           <w:rFonts w:ascii="Arial Nova" w:hAnsi="Arial Nova" w:cs="Calibri"/>
         </w:rPr>
       </w:pPr>
-      <w:bookmarkStart w:id="4" w:name="_Toc230438699"/>
+      <w:bookmarkStart w:id="4" w:name="_Toc230519089"/>
       <w:r>
         <w:rPr>
           <w:rFonts w:ascii="Arial Nova" w:hAnsi="Arial Nova" w:cs="Calibri"/>
@@ -1864,7 +1935,7 @@
           <w:rFonts w:ascii="Arial Nova" w:hAnsi="Arial Nova" w:cs="Calibri"/>
         </w:rPr>
       </w:pPr>
-      <w:bookmarkStart w:id="5" w:name="_Toc230438700"/>
+      <w:bookmarkStart w:id="5" w:name="_Toc230519090"/>
       <w:r>
         <w:rPr>
           <w:rFonts w:ascii="Arial Nova" w:hAnsi="Arial Nova" w:cs="Calibri"/>
@@ -2075,11 +2146,6 @@
           <w:rFonts w:ascii="Arial Nova" w:hAnsi="Arial Nova" w:cs="Calibri"/>
         </w:rPr>
         <w:br/>
-      </w:r>
-      <w:r>
-        <w:rPr>
-          <w:rFonts w:ascii="Arial Nova" w:hAnsi="Arial Nova" w:cs="Calibri"/>
-        </w:rPr>
         <w:t xml:space="preserve">Als Basis für die Softwareentwicklung wurde zunächst ein Erstentwurf des Codes mithilfe der KI </w:t>
       </w:r>
       <w:r>
@@ -2124,11 +2190,6 @@
           <w:rFonts w:ascii="Arial Nova" w:hAnsi="Arial Nova" w:cs="Calibri"/>
         </w:rPr>
         <w:br/>
-      </w:r>
-      <w:r>
-        <w:rPr>
-          <w:rFonts w:ascii="Arial Nova" w:hAnsi="Arial Nova" w:cs="Calibri"/>
-        </w:rPr>
         <w:t xml:space="preserve">Der KI-generierte Erstentwurf wurde im Anschluss eigenständig analysiert und an die realen Anforderungen des Projekts angepasst. Ein Punkt war hierbei die Optimierung der Bedienbarkeit und des Hardware-Aufbaus. So wurde beispielsweise die Pin-Belegung gezielt geändert (Nutzung von PA2 und PA3 für UART2), um die bereits verlöteten Buchsen des Sensors optimal zu nutzen und eine bequeme, fehlerfreie Verkabelung zu </w:t>
       </w:r>
       <w:r>
@@ -2173,11 +2234,6 @@
           <w:rFonts w:ascii="Arial Nova" w:hAnsi="Arial Nova" w:cs="Calibri"/>
         </w:rPr>
         <w:br/>
-      </w:r>
-      <w:r>
-        <w:rPr>
-          <w:rFonts w:ascii="Arial Nova" w:hAnsi="Arial Nova" w:cs="Calibri"/>
-        </w:rPr>
         <w:t xml:space="preserve">In der nächsten Phase wurde das System </w:t>
       </w:r>
       <w:r>
@@ -2225,7 +2281,7 @@
           <w:rFonts w:ascii="Arial Nova" w:hAnsi="Arial Nova" w:cs="Calibri"/>
         </w:rPr>
       </w:pPr>
-      <w:bookmarkStart w:id="6" w:name="_Toc230438701"/>
+      <w:bookmarkStart w:id="6" w:name="_Toc230519091"/>
       <w:r>
         <w:rPr>
           <w:rFonts w:ascii="Arial Nova" w:hAnsi="Arial Nova" w:cs="Calibri"/>
@@ -2632,8 +2688,18 @@
                 <w:b/>
                 <w:bCs/>
               </w:rPr>
-              <w:t>7-Seg Reset</w:t>
-            </w:r>
+              <w:t xml:space="preserve">7-Seg </w:t>
+            </w:r>
+            <w:proofErr w:type="spellStart"/>
+            <w:r>
+              <w:rPr>
+                <w:rFonts w:ascii="Arial Nova" w:hAnsi="Arial Nova" w:cs="Calibri"/>
+                <w:b/>
+                <w:bCs/>
+              </w:rPr>
+              <w:t>Reset</w:t>
+            </w:r>
+            <w:proofErr w:type="spellEnd"/>
           </w:p>
         </w:tc>
         <w:tc>
@@ -2717,7 +2783,7 @@
           <w:rFonts w:ascii="Arial Nova" w:hAnsi="Arial Nova" w:cs="Calibri"/>
         </w:rPr>
       </w:pPr>
-      <w:bookmarkStart w:id="7" w:name="_Toc230438702"/>
+      <w:bookmarkStart w:id="7" w:name="_Toc230519092"/>
       <w:r>
         <w:rPr>
           <w:rFonts w:ascii="Arial Nova" w:hAnsi="Arial Nova" w:cs="Calibri"/>
@@ -2766,7 +2832,7 @@
                     <pic:cNvPicPr/>
                   </pic:nvPicPr>
                   <pic:blipFill>
-                    <a:blip r:embed="rId5"/>
+                    <a:blip r:embed="rId6"/>
                     <a:stretch>
                       <a:fillRect/>
                     </a:stretch>
@@ -2807,7 +2873,7 @@
           <w:rFonts w:ascii="Arial Nova" w:hAnsi="Arial Nova" w:cs="Calibri"/>
         </w:rPr>
       </w:pPr>
-      <w:bookmarkStart w:id="8" w:name="_Toc230438703"/>
+      <w:bookmarkStart w:id="8" w:name="_Toc230519093"/>
       <w:r>
         <w:rPr>
           <w:rFonts w:ascii="Arial Nova" w:hAnsi="Arial Nova" w:cs="Calibri"/>
@@ -3111,7 +3177,7 @@
           <w:rFonts w:ascii="Arial Nova" w:hAnsi="Arial Nova" w:cs="Calibri"/>
         </w:rPr>
       </w:pPr>
-      <w:bookmarkStart w:id="9" w:name="_Toc230438704"/>
+      <w:bookmarkStart w:id="9" w:name="_Toc230519094"/>
       <w:r>
         <w:rPr>
           <w:rFonts w:ascii="Arial Nova" w:hAnsi="Arial Nova" w:cs="Calibri"/>
@@ -3131,10 +3197,72 @@
       <w:pPr>
         <w:pStyle w:val="berschrift2"/>
         <w:rPr>
-          <w:rFonts w:ascii="Arial Nova" w:hAnsi="Arial Nova" w:cs="Calibri"/>
-        </w:rPr>
-      </w:pPr>
-      <w:bookmarkStart w:id="10" w:name="_Toc230438705"/>
+          <w:rFonts w:ascii="Arial Nova" w:hAnsi="Arial Nova"/>
+        </w:rPr>
+      </w:pPr>
+      <w:bookmarkStart w:id="10" w:name="_Toc230519095"/>
+      <w:r>
+        <w:rPr>
+          <w:rFonts w:ascii="Arial Nova" w:hAnsi="Arial Nova"/>
+        </w:rPr>
+        <w:t>7.1 Flussdiagramm</w:t>
+      </w:r>
+      <w:bookmarkEnd w:id="10"/>
+    </w:p>
+    <w:p>
+      <w:pPr>
+        <w:jc w:val="center"/>
+      </w:pPr>
+      <w:r>
+        <w:rPr>
+          <w:rFonts w:ascii="Arial Nova" w:hAnsi="Arial Nova" w:cs="Calibri"/>
+          <w:noProof/>
+        </w:rPr>
+        <w:drawing>
+          <wp:inline distT="0" distB="0" distL="0" distR="0" wp14:anchorId="1F9C5EC9" wp14:editId="744A63FC">
+            <wp:extent cx="5682872" cy="3615690"/>
+            <wp:effectExtent l="4763" t="0" r="0" b="0"/>
+            <wp:docPr id="2095766343" name="Grafik 1"/>
+            <wp:cNvGraphicFramePr>
+              <a:graphicFrameLocks xmlns:a="http://schemas.openxmlformats.org/drawingml/2006/main" noChangeAspect="1"/>
+            </wp:cNvGraphicFramePr>
+            <a:graphic xmlns:a="http://schemas.openxmlformats.org/drawingml/2006/main">
+              <a:graphicData uri="http://schemas.openxmlformats.org/drawingml/2006/picture">
+                <pic:pic xmlns:pic="http://schemas.openxmlformats.org/drawingml/2006/picture">
+                  <pic:nvPicPr>
+                    <pic:cNvPr id="2095766343" name=""/>
+                    <pic:cNvPicPr/>
+                  </pic:nvPicPr>
+                  <pic:blipFill>
+                    <a:blip r:embed="rId7"/>
+                    <a:stretch>
+                      <a:fillRect/>
+                    </a:stretch>
+                  </pic:blipFill>
+                  <pic:spPr>
+                    <a:xfrm rot="16200000">
+                      <a:off x="0" y="0"/>
+                      <a:ext cx="5693639" cy="3622541"/>
+                    </a:xfrm>
+                    <a:prstGeom prst="rect">
+                      <a:avLst/>
+                    </a:prstGeom>
+                  </pic:spPr>
+                </pic:pic>
+              </a:graphicData>
+            </a:graphic>
+          </wp:inline>
+        </w:drawing>
+      </w:r>
+    </w:p>
+    <w:p>
+      <w:pPr>
+        <w:pStyle w:val="berschrift2"/>
+        <w:rPr>
+          <w:rFonts w:ascii="Arial Nova" w:hAnsi="Arial Nova" w:cs="Calibri"/>
+        </w:rPr>
+      </w:pPr>
+      <w:bookmarkStart w:id="11" w:name="_Toc230519096"/>
       <w:r>
         <w:rPr>
           <w:rFonts w:ascii="Arial Nova" w:hAnsi="Arial Nova" w:cs="Calibri"/>
@@ -3145,9 +3273,21 @@
         <w:rPr>
           <w:rFonts w:ascii="Arial Nova" w:hAnsi="Arial Nova" w:cs="Calibri"/>
         </w:rPr>
-        <w:t>.1 Hauptschleife (Main Loop)</w:t>
-      </w:r>
-      <w:bookmarkEnd w:id="10"/>
+        <w:t>.</w:t>
+      </w:r>
+      <w:r>
+        <w:rPr>
+          <w:rFonts w:ascii="Arial Nova" w:hAnsi="Arial Nova" w:cs="Calibri"/>
+        </w:rPr>
+        <w:t>2</w:t>
+      </w:r>
+      <w:r>
+        <w:rPr>
+          <w:rFonts w:ascii="Arial Nova" w:hAnsi="Arial Nova" w:cs="Calibri"/>
+        </w:rPr>
+        <w:t xml:space="preserve"> Hauptschleife (Main Loop)</w:t>
+      </w:r>
+      <w:bookmarkEnd w:id="11"/>
     </w:p>
     <w:p>
       <w:pPr>
@@ -3203,20 +3343,33 @@
           <w:rFonts w:ascii="Arial Nova" w:hAnsi="Arial Nova" w:cs="Calibri"/>
         </w:rPr>
       </w:pPr>
-      <w:bookmarkStart w:id="11" w:name="_Toc230438706"/>
-      <w:r>
-        <w:rPr>
-          <w:rFonts w:ascii="Arial Nova" w:hAnsi="Arial Nova" w:cs="Calibri"/>
-        </w:rPr>
+      <w:bookmarkStart w:id="12" w:name="_Toc230519097"/>
+      <w:r>
+        <w:rPr>
+          <w:rFonts w:ascii="Arial Nova" w:hAnsi="Arial Nova" w:cs="Calibri"/>
+        </w:rPr>
+        <w:lastRenderedPageBreak/>
         <w:t>7</w:t>
       </w:r>
       <w:r>
         <w:rPr>
           <w:rFonts w:ascii="Arial Nova" w:hAnsi="Arial Nova" w:cs="Calibri"/>
         </w:rPr>
-        <w:t>.2 Fehlerbehandlung</w:t>
-      </w:r>
-      <w:bookmarkEnd w:id="11"/>
+        <w:t>.</w:t>
+      </w:r>
+      <w:r>
+        <w:rPr>
+          <w:rFonts w:ascii="Arial Nova" w:hAnsi="Arial Nova" w:cs="Calibri"/>
+        </w:rPr>
+        <w:t>3</w:t>
+      </w:r>
+      <w:r>
+        <w:rPr>
+          <w:rFonts w:ascii="Arial Nova" w:hAnsi="Arial Nova" w:cs="Calibri"/>
+        </w:rPr>
+        <w:t xml:space="preserve"> Fehlerbehandlung</w:t>
+      </w:r>
+      <w:bookmarkEnd w:id="12"/>
     </w:p>
     <w:p>
       <w:pPr>
@@ -3315,7 +3468,7 @@
           <w:rFonts w:ascii="Arial Nova" w:hAnsi="Arial Nova" w:cs="Calibri"/>
         </w:rPr>
       </w:pPr>
-      <w:bookmarkStart w:id="12" w:name="_Toc230438707"/>
+      <w:bookmarkStart w:id="13" w:name="_Toc230519098"/>
       <w:r>
         <w:rPr>
           <w:rFonts w:ascii="Arial Nova" w:hAnsi="Arial Nova" w:cs="Calibri"/>
@@ -3327,9 +3480,17 @@
         <w:rPr>
           <w:rFonts w:ascii="Arial Nova" w:hAnsi="Arial Nova" w:cs="Calibri"/>
         </w:rPr>
-        <w:t>. Code-Analyse: Sensor_ReadData</w:t>
-      </w:r>
-      <w:bookmarkEnd w:id="12"/>
+        <w:t xml:space="preserve">. Code-Analyse: </w:t>
+      </w:r>
+      <w:proofErr w:type="spellStart"/>
+      <w:r>
+        <w:rPr>
+          <w:rFonts w:ascii="Arial Nova" w:hAnsi="Arial Nova" w:cs="Calibri"/>
+        </w:rPr>
+        <w:t>Sensor_ReadData</w:t>
+      </w:r>
+      <w:bookmarkEnd w:id="13"/>
+      <w:proofErr w:type="spellEnd"/>
     </w:p>
     <w:p>
       <w:pPr>
@@ -3365,7 +3526,7 @@
           <w:rFonts w:ascii="Arial Nova" w:hAnsi="Arial Nova" w:cs="Calibri"/>
         </w:rPr>
       </w:pPr>
-      <w:bookmarkStart w:id="13" w:name="_Toc230438708"/>
+      <w:bookmarkStart w:id="14" w:name="_Toc230519099"/>
       <w:r>
         <w:rPr>
           <w:rFonts w:ascii="Arial Nova" w:hAnsi="Arial Nova" w:cs="Calibri"/>
@@ -3384,7 +3545,7 @@
         </w:rPr>
         <w:t>1 Datenübertragung (Senden)</w:t>
       </w:r>
-      <w:bookmarkEnd w:id="13"/>
+      <w:bookmarkEnd w:id="14"/>
     </w:p>
     <w:p>
       <w:pPr>
@@ -3717,7 +3878,7 @@
           <w:rFonts w:ascii="Arial Nova" w:hAnsi="Arial Nova" w:cs="Calibri"/>
         </w:rPr>
       </w:pPr>
-      <w:bookmarkStart w:id="14" w:name="_Toc230438709"/>
+      <w:bookmarkStart w:id="15" w:name="_Toc230519100"/>
       <w:r>
         <w:rPr>
           <w:rFonts w:ascii="Arial Nova" w:hAnsi="Arial Nova" w:cs="Calibri"/>
@@ -3736,7 +3897,7 @@
         </w:rPr>
         <w:t>2 Datenempfang und Pufferung</w:t>
       </w:r>
-      <w:bookmarkEnd w:id="14"/>
+      <w:bookmarkEnd w:id="15"/>
     </w:p>
     <w:p>
       <w:pPr>
@@ -3874,7 +4035,7 @@
           <w:rFonts w:ascii="Arial Nova" w:hAnsi="Arial Nova" w:cs="Calibri"/>
         </w:rPr>
       </w:pPr>
-      <w:bookmarkStart w:id="15" w:name="_Toc230438710"/>
+      <w:bookmarkStart w:id="16" w:name="_Toc230519101"/>
       <w:r>
         <w:rPr>
           <w:rFonts w:ascii="Arial Nova" w:hAnsi="Arial Nova" w:cs="Calibri"/>
@@ -3893,7 +4054,7 @@
         </w:rPr>
         <w:t>3 Berechnung der Prüfsumme</w:t>
       </w:r>
-      <w:bookmarkEnd w:id="15"/>
+      <w:bookmarkEnd w:id="16"/>
     </w:p>
     <w:p>
       <w:pPr>
@@ -4100,7 +4261,7 @@
           <w:rFonts w:ascii="Arial Nova" w:hAnsi="Arial Nova" w:cs="Calibri"/>
         </w:rPr>
       </w:pPr>
-      <w:bookmarkStart w:id="16" w:name="_Toc230438711"/>
+      <w:bookmarkStart w:id="17" w:name="_Toc230519102"/>
       <w:r>
         <w:rPr>
           <w:rFonts w:ascii="Arial Nova" w:hAnsi="Arial Nova" w:cs="Calibri"/>
@@ -4120,7 +4281,7 @@
         </w:rPr>
         <w:t>4 Validierung und Messwert-Rekonstruktion</w:t>
       </w:r>
-      <w:bookmarkEnd w:id="16"/>
+      <w:bookmarkEnd w:id="17"/>
     </w:p>
     <w:p>
       <w:pPr>
@@ -4514,7 +4675,7 @@
           <w:rFonts w:ascii="Arial Nova" w:hAnsi="Arial Nova" w:cs="Calibri"/>
         </w:rPr>
       </w:pPr>
-      <w:bookmarkStart w:id="17" w:name="_Toc230438712"/>
+      <w:bookmarkStart w:id="18" w:name="_Toc230519103"/>
       <w:r>
         <w:rPr>
           <w:rFonts w:ascii="Arial Nova" w:hAnsi="Arial Nova" w:cs="Calibri"/>
@@ -4533,7 +4694,7 @@
         </w:rPr>
         <w:t>5 Fehlerbehandlung</w:t>
       </w:r>
-      <w:bookmarkEnd w:id="17"/>
+      <w:bookmarkEnd w:id="18"/>
     </w:p>
     <w:p>
       <w:pPr>
@@ -4645,6 +4806,7 @@
           <w:rFonts w:ascii="Arial Nova" w:hAnsi="Arial Nova" w:cs="Calibri"/>
           <w:sz w:val="22"/>
           <w:szCs w:val="22"/>
+          <w:lang w:val="en-GB"/>
         </w:rPr>
       </w:pPr>
       <w:r>
@@ -4655,23 +4817,138 @@
         </w:rPr>
         <w:t xml:space="preserve">    </w:t>
       </w:r>
-      <w:proofErr w:type="spellStart"/>
-      <w:r>
-        <w:rPr>
-          <w:rFonts w:ascii="Arial Nova" w:hAnsi="Arial Nova" w:cs="Calibri"/>
-          <w:sz w:val="22"/>
-          <w:szCs w:val="22"/>
-        </w:rPr>
-        <w:t>if</w:t>
-      </w:r>
-      <w:proofErr w:type="spellEnd"/>
-      <w:r>
-        <w:rPr>
-          <w:rFonts w:ascii="Arial Nova" w:hAnsi="Arial Nova" w:cs="Calibri"/>
-          <w:sz w:val="22"/>
-          <w:szCs w:val="22"/>
-        </w:rPr>
-        <w:t xml:space="preserve"> (</w:t>
+      <w:r>
+        <w:rPr>
+          <w:rFonts w:ascii="Arial Nova" w:hAnsi="Arial Nova" w:cs="Calibri"/>
+          <w:sz w:val="22"/>
+          <w:szCs w:val="22"/>
+          <w:lang w:val="en-GB"/>
+        </w:rPr>
+        <w:t>if (</w:t>
+      </w:r>
+      <w:proofErr w:type="gramStart"/>
+      <w:r>
+        <w:rPr>
+          <w:rFonts w:ascii="Arial Nova" w:hAnsi="Arial Nova" w:cs="Calibri"/>
+          <w:sz w:val="22"/>
+          <w:szCs w:val="22"/>
+          <w:lang w:val="en-GB"/>
+        </w:rPr>
+        <w:t>status !</w:t>
+      </w:r>
+      <w:proofErr w:type="gramEnd"/>
+      <w:r>
+        <w:rPr>
+          <w:rFonts w:ascii="Arial Nova" w:hAnsi="Arial Nova" w:cs="Calibri"/>
+          <w:sz w:val="22"/>
+          <w:szCs w:val="22"/>
+          <w:lang w:val="en-GB"/>
+        </w:rPr>
+        <w:t>= HAL_OK) {</w:t>
+      </w:r>
+    </w:p>
+    <w:p>
+      <w:pPr>
+        <w:spacing w:line="240" w:lineRule="auto"/>
+        <w:ind w:left="360"/>
+        <w:rPr>
+          <w:rFonts w:ascii="Arial Nova" w:hAnsi="Arial Nova" w:cs="Calibri"/>
+          <w:sz w:val="22"/>
+          <w:szCs w:val="22"/>
+          <w:lang w:val="en-GB"/>
+        </w:rPr>
+      </w:pPr>
+      <w:r>
+        <w:rPr>
+          <w:rFonts w:ascii="Arial Nova" w:hAnsi="Arial Nova" w:cs="Calibri"/>
+          <w:sz w:val="22"/>
+          <w:szCs w:val="22"/>
+          <w:lang w:val="en-GB"/>
+        </w:rPr>
+        <w:t xml:space="preserve">        </w:t>
+      </w:r>
+      <w:r>
+        <w:rPr>
+          <w:rFonts w:ascii="Arial Nova" w:hAnsi="Arial Nova" w:cs="Calibri"/>
+          <w:sz w:val="22"/>
+          <w:szCs w:val="22"/>
+          <w:lang w:val="en-GB"/>
+        </w:rPr>
+        <w:t>return 0xFFFD; // HAL UART Timeout or Hardware Error</w:t>
+      </w:r>
+    </w:p>
+    <w:p>
+      <w:pPr>
+        <w:spacing w:line="240" w:lineRule="auto"/>
+        <w:ind w:left="360"/>
+        <w:rPr>
+          <w:rFonts w:ascii="Arial Nova" w:hAnsi="Arial Nova" w:cs="Calibri"/>
+          <w:sz w:val="22"/>
+          <w:szCs w:val="22"/>
+          <w:lang w:val="en-GB"/>
+        </w:rPr>
+      </w:pPr>
+      <w:r>
+        <w:rPr>
+          <w:rFonts w:ascii="Arial Nova" w:hAnsi="Arial Nova" w:cs="Calibri"/>
+          <w:sz w:val="22"/>
+          <w:szCs w:val="22"/>
+          <w:lang w:val="en-GB"/>
+        </w:rPr>
+        <w:t xml:space="preserve">    }</w:t>
+      </w:r>
+    </w:p>
+    <w:p>
+      <w:pPr>
+        <w:spacing w:line="240" w:lineRule="auto"/>
+        <w:ind w:left="360"/>
+        <w:rPr>
+          <w:rFonts w:ascii="Arial Nova" w:hAnsi="Arial Nova" w:cs="Calibri"/>
+          <w:sz w:val="22"/>
+          <w:szCs w:val="22"/>
+          <w:lang w:val="en-GB"/>
+        </w:rPr>
+      </w:pPr>
+    </w:p>
+    <w:p>
+      <w:pPr>
+        <w:spacing w:line="240" w:lineRule="auto"/>
+        <w:ind w:left="360"/>
+        <w:rPr>
+          <w:rFonts w:ascii="Arial Nova" w:hAnsi="Arial Nova" w:cs="Calibri"/>
+          <w:sz w:val="22"/>
+          <w:szCs w:val="22"/>
+          <w:lang w:val="en-GB"/>
+        </w:rPr>
+      </w:pPr>
+      <w:r>
+        <w:rPr>
+          <w:rFonts w:ascii="Arial Nova" w:hAnsi="Arial Nova" w:cs="Calibri"/>
+          <w:sz w:val="22"/>
+          <w:szCs w:val="22"/>
+          <w:lang w:val="en-GB"/>
+        </w:rPr>
+        <w:t xml:space="preserve">    if (</w:t>
+      </w:r>
+      <w:proofErr w:type="gramStart"/>
+      <w:r>
+        <w:rPr>
+          <w:rFonts w:ascii="Arial Nova" w:hAnsi="Arial Nova" w:cs="Calibri"/>
+          <w:sz w:val="22"/>
+          <w:szCs w:val="22"/>
+          <w:lang w:val="en-GB"/>
+        </w:rPr>
+        <w:t>checksum !</w:t>
+      </w:r>
+      <w:proofErr w:type="gramEnd"/>
+      <w:r>
+        <w:rPr>
+          <w:rFonts w:ascii="Arial Nova" w:hAnsi="Arial Nova" w:cs="Calibri"/>
+          <w:sz w:val="22"/>
+          <w:szCs w:val="22"/>
+          <w:lang w:val="en-GB"/>
+        </w:rPr>
+        <w:t xml:space="preserve">= </w:t>
       </w:r>
       <w:proofErr w:type="spellStart"/>
       <w:proofErr w:type="gramStart"/>
@@ -4680,8 +4957,9 @@
           <w:rFonts w:ascii="Arial Nova" w:hAnsi="Arial Nova" w:cs="Calibri"/>
           <w:sz w:val="22"/>
           <w:szCs w:val="22"/>
-        </w:rPr>
-        <w:t>status</w:t>
+          <w:lang w:val="en-GB"/>
+        </w:rPr>
+        <w:t>rxBuffer</w:t>
       </w:r>
       <w:proofErr w:type="spellEnd"/>
       <w:r>
@@ -4689,8 +4967,9 @@
           <w:rFonts w:ascii="Arial Nova" w:hAnsi="Arial Nova" w:cs="Calibri"/>
           <w:sz w:val="22"/>
           <w:szCs w:val="22"/>
-        </w:rPr>
-        <w:t xml:space="preserve"> !</w:t>
+          <w:lang w:val="en-GB"/>
+        </w:rPr>
+        <w:t>[</w:t>
       </w:r>
       <w:proofErr w:type="gramEnd"/>
       <w:r>
@@ -4698,8 +4977,9 @@
           <w:rFonts w:ascii="Arial Nova" w:hAnsi="Arial Nova" w:cs="Calibri"/>
           <w:sz w:val="22"/>
           <w:szCs w:val="22"/>
-        </w:rPr>
-        <w:t>= HAL_OK) {</w:t>
+          <w:lang w:val="en-GB"/>
+        </w:rPr>
+        <w:t>3]) {</w:t>
       </w:r>
     </w:p>
     <w:p>
@@ -4718,17 +4998,9 @@
           <w:rFonts w:ascii="Arial Nova" w:hAnsi="Arial Nova" w:cs="Calibri"/>
           <w:sz w:val="22"/>
           <w:szCs w:val="22"/>
-        </w:rPr>
-        <w:t xml:space="preserve">        </w:t>
-      </w:r>
-      <w:r>
-        <w:rPr>
-          <w:rFonts w:ascii="Arial Nova" w:hAnsi="Arial Nova" w:cs="Calibri"/>
-          <w:sz w:val="22"/>
-          <w:szCs w:val="22"/>
           <w:lang w:val="en-GB"/>
         </w:rPr>
-        <w:t>return 0xFFFD; // HAL UART Timeout or Hardware Error</w:t>
+        <w:t xml:space="preserve">        return 0xFFFE; // Checksum Mismatch (Data Corrupted)</w:t>
       </w:r>
     </w:p>
     <w:p>
@@ -4763,132 +5035,6 @@
           <w:lang w:val="en-GB"/>
         </w:rPr>
       </w:pPr>
-    </w:p>
-    <w:p>
-      <w:pPr>
-        <w:spacing w:line="240" w:lineRule="auto"/>
-        <w:ind w:left="360"/>
-        <w:rPr>
-          <w:rFonts w:ascii="Arial Nova" w:hAnsi="Arial Nova" w:cs="Calibri"/>
-          <w:sz w:val="22"/>
-          <w:szCs w:val="22"/>
-          <w:lang w:val="en-GB"/>
-        </w:rPr>
-      </w:pPr>
-      <w:r>
-        <w:rPr>
-          <w:rFonts w:ascii="Arial Nova" w:hAnsi="Arial Nova" w:cs="Calibri"/>
-          <w:sz w:val="22"/>
-          <w:szCs w:val="22"/>
-          <w:lang w:val="en-GB"/>
-        </w:rPr>
-        <w:t xml:space="preserve">    if (</w:t>
-      </w:r>
-      <w:proofErr w:type="gramStart"/>
-      <w:r>
-        <w:rPr>
-          <w:rFonts w:ascii="Arial Nova" w:hAnsi="Arial Nova" w:cs="Calibri"/>
-          <w:sz w:val="22"/>
-          <w:szCs w:val="22"/>
-          <w:lang w:val="en-GB"/>
-        </w:rPr>
-        <w:t>checksum !</w:t>
-      </w:r>
-      <w:proofErr w:type="gramEnd"/>
-      <w:r>
-        <w:rPr>
-          <w:rFonts w:ascii="Arial Nova" w:hAnsi="Arial Nova" w:cs="Calibri"/>
-          <w:sz w:val="22"/>
-          <w:szCs w:val="22"/>
-          <w:lang w:val="en-GB"/>
-        </w:rPr>
-        <w:t xml:space="preserve">= </w:t>
-      </w:r>
-      <w:proofErr w:type="spellStart"/>
-      <w:proofErr w:type="gramStart"/>
-      <w:r>
-        <w:rPr>
-          <w:rFonts w:ascii="Arial Nova" w:hAnsi="Arial Nova" w:cs="Calibri"/>
-          <w:sz w:val="22"/>
-          <w:szCs w:val="22"/>
-          <w:lang w:val="en-GB"/>
-        </w:rPr>
-        <w:t>rxBuffer</w:t>
-      </w:r>
-      <w:proofErr w:type="spellEnd"/>
-      <w:r>
-        <w:rPr>
-          <w:rFonts w:ascii="Arial Nova" w:hAnsi="Arial Nova" w:cs="Calibri"/>
-          <w:sz w:val="22"/>
-          <w:szCs w:val="22"/>
-          <w:lang w:val="en-GB"/>
-        </w:rPr>
-        <w:t>[</w:t>
-      </w:r>
-      <w:proofErr w:type="gramEnd"/>
-      <w:r>
-        <w:rPr>
-          <w:rFonts w:ascii="Arial Nova" w:hAnsi="Arial Nova" w:cs="Calibri"/>
-          <w:sz w:val="22"/>
-          <w:szCs w:val="22"/>
-          <w:lang w:val="en-GB"/>
-        </w:rPr>
-        <w:t>3]) {</w:t>
-      </w:r>
-    </w:p>
-    <w:p>
-      <w:pPr>
-        <w:spacing w:line="240" w:lineRule="auto"/>
-        <w:ind w:left="360"/>
-        <w:rPr>
-          <w:rFonts w:ascii="Arial Nova" w:hAnsi="Arial Nova" w:cs="Calibri"/>
-          <w:sz w:val="22"/>
-          <w:szCs w:val="22"/>
-          <w:lang w:val="en-GB"/>
-        </w:rPr>
-      </w:pPr>
-      <w:r>
-        <w:rPr>
-          <w:rFonts w:ascii="Arial Nova" w:hAnsi="Arial Nova" w:cs="Calibri"/>
-          <w:sz w:val="22"/>
-          <w:szCs w:val="22"/>
-          <w:lang w:val="en-GB"/>
-        </w:rPr>
-        <w:t xml:space="preserve">        return 0xFFFE; // Checksum Mismatch (Data Corrupted)</w:t>
-      </w:r>
-    </w:p>
-    <w:p>
-      <w:pPr>
-        <w:spacing w:line="240" w:lineRule="auto"/>
-        <w:ind w:left="360"/>
-        <w:rPr>
-          <w:rFonts w:ascii="Arial Nova" w:hAnsi="Arial Nova" w:cs="Calibri"/>
-          <w:sz w:val="22"/>
-          <w:szCs w:val="22"/>
-          <w:lang w:val="en-GB"/>
-        </w:rPr>
-      </w:pPr>
-      <w:r>
-        <w:rPr>
-          <w:rFonts w:ascii="Arial Nova" w:hAnsi="Arial Nova" w:cs="Calibri"/>
-          <w:sz w:val="22"/>
-          <w:szCs w:val="22"/>
-          <w:lang w:val="en-GB"/>
-        </w:rPr>
-        <w:t xml:space="preserve">    }</w:t>
-      </w:r>
-    </w:p>
-    <w:p>
-      <w:pPr>
-        <w:spacing w:line="240" w:lineRule="auto"/>
-        <w:ind w:left="360"/>
-        <w:rPr>
-          <w:rFonts w:ascii="Arial Nova" w:hAnsi="Arial Nova" w:cs="Calibri"/>
-          <w:sz w:val="22"/>
-          <w:szCs w:val="22"/>
-          <w:lang w:val="en-GB"/>
-        </w:rPr>
-      </w:pPr>
       <w:r>
         <w:rPr>
           <w:rFonts w:ascii="Arial Nova" w:hAnsi="Arial Nova" w:cs="Calibri"/>
@@ -4937,7 +5083,7 @@
           <w:rFonts w:ascii="Arial Nova" w:hAnsi="Arial Nova" w:cs="Calibri"/>
         </w:rPr>
       </w:pPr>
-      <w:bookmarkStart w:id="18" w:name="_Toc230438713"/>
+      <w:bookmarkStart w:id="19" w:name="_Toc230519104"/>
       <w:r>
         <w:rPr>
           <w:rFonts w:ascii="Arial Nova" w:hAnsi="Arial Nova" w:cs="Calibri"/>
@@ -4956,7 +5102,7 @@
         </w:rPr>
         <w:t>Messschwierigkeiten</w:t>
       </w:r>
-      <w:bookmarkEnd w:id="18"/>
+      <w:bookmarkEnd w:id="19"/>
     </w:p>
     <w:p>
       <w:pPr>
@@ -5052,7 +5198,7 @@
                     <pic:cNvPicPr/>
                   </pic:nvPicPr>
                   <pic:blipFill>
-                    <a:blip r:embed="rId6"/>
+                    <a:blip r:embed="rId8"/>
                     <a:stretch>
                       <a:fillRect/>
                     </a:stretch>
@@ -5080,7 +5226,7 @@
           <w:rFonts w:ascii="Arial Nova" w:hAnsi="Arial Nova" w:cs="Calibri"/>
         </w:rPr>
       </w:pPr>
-      <w:bookmarkStart w:id="19" w:name="_Toc230438714"/>
+      <w:bookmarkStart w:id="20" w:name="_Toc230519105"/>
       <w:r>
         <w:rPr>
           <w:rFonts w:ascii="Arial Nova" w:hAnsi="Arial Nova" w:cs="Calibri"/>
@@ -5094,7 +5240,7 @@
         </w:rPr>
         <w:t>. Zusammenfassung</w:t>
       </w:r>
-      <w:bookmarkEnd w:id="19"/>
+      <w:bookmarkEnd w:id="20"/>
     </w:p>
     <w:p>
       <w:pPr>
@@ -5163,13 +5309,6 @@
         </w:rPr>
         <w:t>100)) sorgt für eine stabile Anzeige ohne Flackern, während sie dem Sensor genug Zeit für die Ultraschall-Laufzeitmessung lässt. Die aktive Kommunikation wird an der Hardware visuell bestätigt: Die Status-LED des Sensors blinkt im Takt der Abfragen exakt zehnmal pro Sekunde blau.</w:t>
       </w:r>
-    </w:p>
-    <w:p>
-      <w:pPr>
-        <w:rPr>
-          <w:rFonts w:ascii="Arial Nova" w:hAnsi="Arial Nova" w:cs="Calibri"/>
-        </w:rPr>
-      </w:pPr>
     </w:p>
     <w:p>
       <w:pPr>
@@ -8071,6 +8210,7 @@
   <w:style w:type="character" w:default="1" w:styleId="Absatz-Standardschriftart">
     <w:name w:val="Default Paragraph Font"/>
     <w:uiPriority w:val="1"/>
+    <w:semiHidden/>
     <w:unhideWhenUsed/>
   </w:style>
   <w:style w:type="table" w:default="1" w:styleId="NormaleTabelle">
@@ -8735,4 +8875,16 @@
     </a:ext>
   </a:extLst>
 </a:theme>
+</file>
+
+<file path=customXml/item1.xml><?xml version="1.0" encoding="utf-8"?>
+<b:Sources xmlns:b="http://schemas.openxmlformats.org/officeDocument/2006/bibliography" xmlns="http://schemas.openxmlformats.org/officeDocument/2006/bibliography" SelectedStyle="\APASixthEditionOfficeOnline.xsl" StyleName="APA" Version="6"/>
+</file>
+
+<file path=customXml/itemProps1.xml><?xml version="1.0" encoding="utf-8"?>
+<ds:datastoreItem xmlns:ds="http://schemas.openxmlformats.org/officeDocument/2006/customXml" ds:itemID="{3153BF9D-4EDD-4B9F-A3CB-CC4A01C6E3FE}">
+  <ds:schemaRefs>
+    <ds:schemaRef ds:uri="http://schemas.openxmlformats.org/officeDocument/2006/bibliography"/>
+  </ds:schemaRefs>
+</ds:datastoreItem>
 </file>
</xml_diff>